<commit_message>
feat(main): make course structure
</commit_message>
<xml_diff>
--- a/labs/lab01/report/report.docx
+++ b/labs/lab01/report/report.docx
@@ -111,17 +111,17 @@
         <w:pStyle w:val="FirstParagraph"/>
       </w:pPr>
       <w:r>
-        <w:t xml:space="preserve">Целью данной работы является приобретение практических навыков установки операционной системы на виртуальную машину, настройки минимально необходимых для</w:t>
-      </w:r>
-      <w:r>
-        <w:t xml:space="preserve"> </w:t>
-      </w:r>
-      <w:r>
-        <w:t xml:space="preserve">дальнейшей работы сервисов.</w:t>
+        <w:t xml:space="preserve">Целью данной работы является приобретение практических навыков установки</w:t>
+      </w:r>
+      <w:r>
+        <w:t xml:space="preserve"> </w:t>
+      </w:r>
+      <w:r>
+        <w:t xml:space="preserve">Rocky Linux на виртуальную машину с помощью инструмента Vagrant.</w:t>
       </w:r>
     </w:p>
     <w:bookmarkEnd w:id="20"/>
-    <w:bookmarkStart w:id="33" w:name="выполнение-лабораторной-работы"/>
+    <w:bookmarkStart w:id="21" w:name="задание"/>
     <w:p>
       <w:pPr>
         <w:pStyle w:val="Heading1"/>
@@ -136,7 +136,7 @@
         <w:tab/>
       </w:r>
       <w:r>
-        <w:t xml:space="preserve">Выполнение лабораторной работы</w:t>
+        <w:t xml:space="preserve">Задание</w:t>
       </w:r>
     </w:p>
     <w:p>
@@ -148,7 +148,182 @@
         </w:numPr>
       </w:pPr>
       <w:r>
-        <w:t xml:space="preserve">Установим дистрабутив Rocky на виртуальную машину скачав с сайта. Создаем и настраиваем виртуальную машину(рис. 1)</w:t>
+        <w:t xml:space="preserve">Сформируйте box-файл с дистрибутивом Rocky Linux для VirtualBox.</w:t>
+      </w:r>
+    </w:p>
+    <w:p>
+      <w:pPr>
+        <w:pStyle w:val="Compact"/>
+        <w:numPr>
+          <w:ilvl w:val="0"/>
+          <w:numId w:val="1001"/>
+        </w:numPr>
+      </w:pPr>
+      <w:r>
+        <w:t xml:space="preserve">Запустите виртуальные машины сервера и клиента и убедитесь в их работоспособности.</w:t>
+      </w:r>
+    </w:p>
+    <w:p>
+      <w:pPr>
+        <w:pStyle w:val="Compact"/>
+        <w:numPr>
+          <w:ilvl w:val="0"/>
+          <w:numId w:val="1001"/>
+        </w:numPr>
+      </w:pPr>
+      <w:r>
+        <w:t xml:space="preserve">Внесите изменения в настройки загрузки образов виртуальных машин server</w:t>
+      </w:r>
+      <w:r>
+        <w:t xml:space="preserve"> </w:t>
+      </w:r>
+      <w:r>
+        <w:t xml:space="preserve">и client, добавив пользователя с правами администратора и изменив названия</w:t>
+      </w:r>
+      <w:r>
+        <w:t xml:space="preserve"> </w:t>
+      </w:r>
+      <w:r>
+        <w:t xml:space="preserve">хостов.</w:t>
+      </w:r>
+    </w:p>
+    <w:p>
+      <w:pPr>
+        <w:pStyle w:val="Compact"/>
+        <w:numPr>
+          <w:ilvl w:val="0"/>
+          <w:numId w:val="1001"/>
+        </w:numPr>
+      </w:pPr>
+      <w:r>
+        <w:t xml:space="preserve">Скопируйте необходимые для работы с Vagrant файлы и box-файлы виртуальных</w:t>
+      </w:r>
+      <w:r>
+        <w:t xml:space="preserve"> </w:t>
+      </w:r>
+      <w:r>
+        <w:t xml:space="preserve">машин на внешний носитель. Используя эти файлы, вы можете попробовать развернуть виртуальные машины на другом компьютере.</w:t>
+      </w:r>
+    </w:p>
+    <w:bookmarkEnd w:id="21"/>
+    <w:bookmarkStart w:id="43" w:name="выполнение-лабораторной-работы"/>
+    <w:p>
+      <w:pPr>
+        <w:pStyle w:val="Heading1"/>
+      </w:pPr>
+      <w:r>
+        <w:rPr>
+          <w:rStyle w:val="SectionNumber"/>
+        </w:rPr>
+        <w:t xml:space="preserve">3</w:t>
+      </w:r>
+      <w:r>
+        <w:tab/>
+      </w:r>
+      <w:r>
+        <w:t xml:space="preserve">Выполнение лабораторной работы</w:t>
+      </w:r>
+    </w:p>
+    <w:p>
+      <w:pPr>
+        <w:pStyle w:val="Compact"/>
+        <w:numPr>
+          <w:ilvl w:val="0"/>
+          <w:numId w:val="1002"/>
+        </w:numPr>
+      </w:pPr>
+      <w:r>
+        <w:t xml:space="preserve">Перед началом работы с Vagrant создайте каталог для проекта.</w:t>
+      </w:r>
+      <w:r>
+        <w:t xml:space="preserve"> </w:t>
+      </w:r>
+      <w:r>
+        <w:t xml:space="preserve">В ОС Linux рекомендуется работать в /var/tmp:</w:t>
+      </w:r>
+      <w:r>
+        <w:t xml:space="preserve"> </w:t>
+      </w:r>
+      <w:r>
+        <w:t xml:space="preserve">mkdir -p /var/tmp/user_name/packer</w:t>
+      </w:r>
+      <w:r>
+        <w:t xml:space="preserve"> </w:t>
+      </w:r>
+      <w:r>
+        <w:t xml:space="preserve">mkdir -p /var/tmp/user_name/vagrant</w:t>
+      </w:r>
+      <w:r>
+        <w:t xml:space="preserve"> </w:t>
+      </w:r>
+      <w:r>
+        <w:t xml:space="preserve">где user_name — идентифицирующее вас имя пользователя, обычно первые буквы</w:t>
+      </w:r>
+      <w:r>
+        <w:t xml:space="preserve"> </w:t>
+      </w:r>
+      <w:r>
+        <w:t xml:space="preserve">инициалов и фамилия.</w:t>
+      </w:r>
+      <w:r>
+        <w:t xml:space="preserve"> </w:t>
+      </w:r>
+      <w:r>
+        <w:t xml:space="preserve">В ОС Windows, например, C:/work/user_name/packer и C:/work/user_name/vagrant,</w:t>
+      </w:r>
+      <w:r>
+        <w:t xml:space="preserve"> </w:t>
+      </w:r>
+      <w:r>
+        <w:t xml:space="preserve">где user_name — идентифицирующее вас имя пользователя, обычно первые буквы</w:t>
+      </w:r>
+      <w:r>
+        <w:t xml:space="preserve"> </w:t>
+      </w:r>
+      <w:r>
+        <w:t xml:space="preserve">инициалов и фамилия.</w:t>
+      </w:r>
+    </w:p>
+    <w:p>
+      <w:pPr>
+        <w:pStyle w:val="Compact"/>
+        <w:numPr>
+          <w:ilvl w:val="0"/>
+          <w:numId w:val="1002"/>
+        </w:numPr>
+      </w:pPr>
+      <w:r>
+        <w:t xml:space="preserve">В созданном рабочем каталоге в подкаталоге packer разместите образ вариан-</w:t>
+      </w:r>
+      <w:r>
+        <w:t xml:space="preserve"> </w:t>
+      </w:r>
+      <w:r>
+        <w:t xml:space="preserve">та операционной системы Rocky Linux (в этом практикуме будем использовать</w:t>
+      </w:r>
+      <w:r>
+        <w:t xml:space="preserve"> </w:t>
+      </w:r>
+      <w:r>
+        <w:t xml:space="preserve">Rocky-10.0-x86_64-minimal.iso — минимальный дистрибутив Rocky Linux, который</w:t>
+      </w:r>
+      <w:r>
+        <w:t xml:space="preserve"> </w:t>
+      </w:r>
+      <w:r>
+        <w:t xml:space="preserve">можно взять с сайта https://rockylinux.org/download/). При работе в дис-</w:t>
+      </w:r>
+      <w:r>
+        <w:t xml:space="preserve"> </w:t>
+      </w:r>
+      <w:r>
+        <w:t xml:space="preserve">плейном классе университета дистрибутив можно взять из общего каталога</w:t>
+      </w:r>
+      <w:r>
+        <w:t xml:space="preserve"> </w:t>
+      </w:r>
+      <w:r>
+        <w:t xml:space="preserve">/afs/dk.sci.pfu.edu.ru/common/files/iso/.(рис. 1)</w:t>
       </w:r>
     </w:p>
     <w:p>
@@ -158,20 +333,20 @@
       <w:r>
         <w:drawing>
           <wp:inline>
-            <wp:extent cx="3733800" cy="2483140"/>
+            <wp:extent cx="3733800" cy="3032298"/>
             <wp:effectExtent b="0" l="0" r="0" t="0"/>
-            <wp:docPr descr="Дистрабутив Rocky" title="" id="22" name="Picture"/>
+            <wp:docPr descr="Подкаталог packer" title="" id="23" name="Picture"/>
             <a:graphic>
               <a:graphicData uri="http://schemas.openxmlformats.org/drawingml/2006/picture">
                 <pic:pic>
                   <pic:nvPicPr>
-                    <pic:cNvPr descr="image/1.png" id="23" name="Picture"/>
+                    <pic:cNvPr descr="image/1.png" id="24" name="Picture"/>
                     <pic:cNvPicPr>
                       <a:picLocks noChangeArrowheads="1" noChangeAspect="1"/>
                     </pic:cNvPicPr>
                   </pic:nvPicPr>
                   <pic:blipFill>
-                    <a:blip r:embed="rId21"/>
+                    <a:blip r:embed="rId22"/>
                     <a:stretch>
                       <a:fillRect/>
                     </a:stretch>
@@ -179,7 +354,7 @@
                   <pic:spPr bwMode="auto">
                     <a:xfrm>
                       <a:off x="0" y="0"/>
-                      <a:ext cx="3733800" cy="2483140"/>
+                      <a:ext cx="3733800" cy="3032298"/>
                     </a:xfrm>
                     <a:prstGeom prst="rect">
                       <a:avLst/>
@@ -203,7 +378,7 @@
         <w:pStyle w:val="ImageCaption"/>
       </w:pPr>
       <w:r>
-        <w:t xml:space="preserve">Рис. 1: Дистрабутив Rocky</w:t>
+        <w:t xml:space="preserve">Рис. 1: Подкаталог packer</w:t>
       </w:r>
     </w:p>
     <w:p>
@@ -211,11 +386,137 @@
         <w:pStyle w:val="Compact"/>
         <w:numPr>
           <w:ilvl w:val="0"/>
-          <w:numId w:val="1002"/>
+          <w:numId w:val="1003"/>
         </w:numPr>
       </w:pPr>
       <w:r>
-        <w:t xml:space="preserve">Настраиваем образ установки (рис. 2)</w:t>
+        <w:t xml:space="preserve">В этом же рабочем каталоге разместите подготовленные заранее для работы</w:t>
+      </w:r>
+      <w:r>
+        <w:t xml:space="preserve"> </w:t>
+      </w:r>
+      <w:r>
+        <w:t xml:space="preserve">с Vagrant файлы:</w:t>
+      </w:r>
+      <w:r>
+        <w:t xml:space="preserve"> </w:t>
+      </w:r>
+      <w:r>
+        <w:t xml:space="preserve">– в подкаталоге packer файл vagrant-rocky.pkr.hcl — специальный файл с опи-</w:t>
+      </w:r>
+      <w:r>
+        <w:t xml:space="preserve"> </w:t>
+      </w:r>
+      <w:r>
+        <w:t xml:space="preserve">санием метаданных по установке дистрибутива на виртуальную машину</w:t>
+      </w:r>
+      <w:r>
+        <w:t xml:space="preserve"> </w:t>
+      </w:r>
+      <w:r>
+        <w:t xml:space="preserve">(содержание используемого в данном практикуме файла .hcl приведено в разде-</w:t>
+      </w:r>
+      <w:r>
+        <w:t xml:space="preserve"> </w:t>
+      </w:r>
+      <w:r>
+        <w:t xml:space="preserve">ле 1.5.1.1); в частности, в разделе переменных этот файл содержит указание на</w:t>
+      </w:r>
+      <w:r>
+        <w:t xml:space="preserve"> </w:t>
+      </w:r>
+      <w:r>
+        <w:t xml:space="preserve">версию дистрибутива, его хэш-функцию, имя и пароль пользователя по умолча-</w:t>
+      </w:r>
+      <w:r>
+        <w:t xml:space="preserve"> </w:t>
+      </w:r>
+      <w:r>
+        <w:t xml:space="preserve">нию; в разделе builders указаны специальные синтаксические конструкции для</w:t>
+      </w:r>
+      <w:r>
+        <w:t xml:space="preserve"> </w:t>
+      </w:r>
+      <w:r>
+        <w:t xml:space="preserve">автоматизации работы VirtualBox; в разделе provisioners прописаны действия</w:t>
+      </w:r>
+      <w:r>
+        <w:t xml:space="preserve"> </w:t>
+      </w:r>
+      <w:r>
+        <w:t xml:space="preserve">(по сути shell-скрипт) по установке дополнительных пакетов дистрибутива;</w:t>
+      </w:r>
+      <w:r>
+        <w:t xml:space="preserve"> </w:t>
+      </w:r>
+      <w:r>
+        <w:t xml:space="preserve">– в подкаталоге packer подкаталог http с файлом ks.cfg — определяет настрой-</w:t>
+      </w:r>
+      <w:r>
+        <w:t xml:space="preserve"> </w:t>
+      </w:r>
+      <w:r>
+        <w:t xml:space="preserve">ки для установки дистрибутива, которые пользователь обычно вводит вручную,</w:t>
+      </w:r>
+      <w:r>
+        <w:t xml:space="preserve"> </w:t>
+      </w:r>
+      <w:r>
+        <w:t xml:space="preserve">в частности настройки языка интерфейса, языковые настройки клавиатуры,</w:t>
+      </w:r>
+      <w:r>
+        <w:t xml:space="preserve"> </w:t>
+      </w:r>
+      <w:r>
+        <w:t xml:space="preserve">тайм-зону, сетевые настройки и т.п.; файл ks.cfg должен быть расположен</w:t>
+      </w:r>
+      <w:r>
+        <w:t xml:space="preserve"> </w:t>
+      </w:r>
+      <w:r>
+        <w:t xml:space="preserve">в подкаталоге http (содержание используемого в данном практикуме файла</w:t>
+      </w:r>
+      <w:r>
+        <w:t xml:space="preserve"> </w:t>
+      </w:r>
+      <w:r>
+        <w:t xml:space="preserve">./http/ks.cfg приведено в разделе 1.5.1.2);</w:t>
+      </w:r>
+      <w:r>
+        <w:t xml:space="preserve"> </w:t>
+      </w:r>
+      <w:r>
+        <w:t xml:space="preserve">– в подкаталоге vagrant файл Vagrantfile — файл с конфигурацией запуска вир-</w:t>
+      </w:r>
+      <w:r>
+        <w:t xml:space="preserve"> </w:t>
+      </w:r>
+      <w:r>
+        <w:t xml:space="preserve">туальных машин — сервера и клиента (содержание используемого в данном</w:t>
+      </w:r>
+      <w:r>
+        <w:t xml:space="preserve"> </w:t>
+      </w:r>
+      <w:r>
+        <w:t xml:space="preserve">практикуме на данном этапе файла Vagrantfile приведено в разделе 1.5.1.3);</w:t>
+      </w:r>
+      <w:r>
+        <w:t xml:space="preserve"> </w:t>
+      </w:r>
+      <w:r>
+        <w:t xml:space="preserve">– в подкаталоге vagrant файл Makefile — набор инструкций для программы make</w:t>
+      </w:r>
+      <w:r>
+        <w:t xml:space="preserve"> </w:t>
+      </w:r>
+      <w:r>
+        <w:t xml:space="preserve">по работе с Vagrant (содержание используемого в данном практикуме файла</w:t>
+      </w:r>
+      <w:r>
+        <w:t xml:space="preserve"> </w:t>
+      </w:r>
+      <w:r>
+        <w:t xml:space="preserve">Makefile приведено в разделе 1.5.1.5). (рис. 2)</w:t>
       </w:r>
     </w:p>
     <w:p>
@@ -225,20 +526,20 @@
       <w:r>
         <w:drawing>
           <wp:inline>
-            <wp:extent cx="3733800" cy="2441330"/>
+            <wp:extent cx="3733800" cy="1906468"/>
             <wp:effectExtent b="0" l="0" r="0" t="0"/>
-            <wp:docPr descr="Настройка виртуальной машины" title="" id="25" name="Picture"/>
+            <wp:docPr descr="Код файла Vagrantfile" title="" id="26" name="Picture"/>
             <a:graphic>
               <a:graphicData uri="http://schemas.openxmlformats.org/drawingml/2006/picture">
                 <pic:pic>
                   <pic:nvPicPr>
-                    <pic:cNvPr descr="image/2.png" id="26" name="Picture"/>
+                    <pic:cNvPr descr="image/2.png" id="27" name="Picture"/>
                     <pic:cNvPicPr>
                       <a:picLocks noChangeArrowheads="1" noChangeAspect="1"/>
                     </pic:cNvPicPr>
                   </pic:nvPicPr>
                   <pic:blipFill>
-                    <a:blip r:embed="rId24"/>
+                    <a:blip r:embed="rId25"/>
                     <a:stretch>
                       <a:fillRect/>
                     </a:stretch>
@@ -246,7 +547,7 @@
                   <pic:spPr bwMode="auto">
                     <a:xfrm>
                       <a:off x="0" y="0"/>
-                      <a:ext cx="3733800" cy="2441330"/>
+                      <a:ext cx="3733800" cy="1906468"/>
                     </a:xfrm>
                     <a:prstGeom prst="rect">
                       <a:avLst/>
@@ -270,19 +571,169 @@
         <w:pStyle w:val="ImageCaption"/>
       </w:pPr>
       <w:r>
-        <w:t xml:space="preserve">Рис. 2: Настройка виртуальной машины</w:t>
-      </w:r>
-    </w:p>
-    <w:p>
-      <w:pPr>
-        <w:pStyle w:val="Compact"/>
-        <w:numPr>
-          <w:ilvl w:val="0"/>
-          <w:numId w:val="1003"/>
-        </w:numPr>
-      </w:pPr>
-      <w:r>
-        <w:t xml:space="preserve">Ждем установку (рис. 3)</w:t>
+        <w:t xml:space="preserve">Рис. 2: Код файла Vagrantfile</w:t>
+      </w:r>
+    </w:p>
+    <w:p>
+      <w:pPr>
+        <w:pStyle w:val="BodyText"/>
+      </w:pPr>
+      <w:r>
+        <w:t xml:space="preserve">Основное назначение Makefile в этом практикуме — применение команд Vagrant</w:t>
+      </w:r>
+      <w:r>
+        <w:t xml:space="preserve"> </w:t>
+      </w:r>
+      <w:r>
+        <w:t xml:space="preserve">в ОС Linux в определённом каталоге — только в каталоге с проектом (в частно-</w:t>
+      </w:r>
+      <w:r>
+        <w:t xml:space="preserve"> </w:t>
+      </w:r>
+      <w:r>
+        <w:t xml:space="preserve">сти в /var/tmp/user_name/vagrant). Для пользователей, работающих с Vagrant в ОС</w:t>
+      </w:r>
+      <w:r>
+        <w:t xml:space="preserve"> </w:t>
+      </w:r>
+      <w:r>
+        <w:t xml:space="preserve">Windows, Makefile не понадобится.</w:t>
+      </w:r>
+      <w:r>
+        <w:t xml:space="preserve"> </w:t>
+      </w:r>
+      <w:r>
+        <w:t xml:space="preserve">4. В этом же рабочем каталоге в подкаталоге vagrant создайте каталог provision</w:t>
+      </w:r>
+      <w:r>
+        <w:t xml:space="preserve"> </w:t>
+      </w:r>
+      <w:r>
+        <w:t xml:space="preserve">с подкаталогами default, server и client, в которых будут размещаться скрипты,</w:t>
+      </w:r>
+      <w:r>
+        <w:t xml:space="preserve"> </w:t>
+      </w:r>
+      <w:r>
+        <w:t xml:space="preserve">изменяющие настройки внутреннего окружения базового (общего) образа вирту-</w:t>
+      </w:r>
+      <w:r>
+        <w:t xml:space="preserve"> </w:t>
+      </w:r>
+      <w:r>
+        <w:t xml:space="preserve">альной машины, сервера или клиента соответственно.</w:t>
+      </w:r>
+      <w:r>
+        <w:t xml:space="preserve"> </w:t>
+      </w:r>
+      <w:r>
+        <w:t xml:space="preserve">5. В каталогах default, server и client разместите заранее подготовленный скрипт-</w:t>
+      </w:r>
+      <w:r>
+        <w:t xml:space="preserve"> </w:t>
+      </w:r>
+      <w:r>
+        <w:t xml:space="preserve">заглушку 01-dummy.sh.</w:t>
+      </w:r>
+      <w:r>
+        <w:t xml:space="preserve"> </w:t>
+      </w:r>
+      <w:r>
+        <w:t xml:space="preserve">. В каталоге default разместите заранее подготовленный скрипт 01-user.sh по из-</w:t>
+      </w:r>
+      <w:r>
+        <w:t xml:space="preserve"> </w:t>
+      </w:r>
+      <w:r>
+        <w:t xml:space="preserve">менению названия виртуальной машины.</w:t>
+      </w:r>
+      <w:r>
+        <w:t xml:space="preserve"> </w:t>
+      </w:r>
+      <w:r>
+        <w:t xml:space="preserve">7. В каталоге default разместите заранее подготовленный скрипт 01-hostname.sh по</w:t>
+      </w:r>
+      <w:r>
+        <w:t xml:space="preserve"> </w:t>
+      </w:r>
+      <w:r>
+        <w:t xml:space="preserve">изменению названия виртуальной машины.</w:t>
+      </w:r>
+      <w:r>
+        <w:t xml:space="preserve"> </w:t>
+      </w:r>
+      <w:r>
+        <w:t xml:space="preserve">8. В каталоге server разместите заранее подготовленный скрипт 02-forward.sh.</w:t>
+      </w:r>
+      <w:r>
+        <w:t xml:space="preserve"> </w:t>
+      </w:r>
+      <w:r>
+        <w:t xml:space="preserve">9. В каталоге client разместите заранее подготовленный скрипт 01-routing.sh.</w:t>
+      </w:r>
+    </w:p>
+    <w:p>
+      <w:pPr>
+        <w:pStyle w:val="BodyText"/>
+      </w:pPr>
+      <w:r>
+        <w:t xml:space="preserve">Развёртывание лабораторного стенда на ОС Windows.</w:t>
+      </w:r>
+    </w:p>
+    <w:p>
+      <w:pPr>
+        <w:pStyle w:val="BodyText"/>
+      </w:pPr>
+      <w:r>
+        <w:t xml:space="preserve">В данном разделе приведена последовательность действий при развёртывании</w:t>
+      </w:r>
+      <w:r>
+        <w:t xml:space="preserve"> </w:t>
+      </w:r>
+      <w:r>
+        <w:t xml:space="preserve">образа виртуальной машины в ОС Windows на домашнем компьютере в VirtualBox</w:t>
+      </w:r>
+      <w:r>
+        <w:t xml:space="preserve"> </w:t>
+      </w:r>
+      <w:r>
+        <w:t xml:space="preserve">с использованием Vagrant. После установки необходимого программного обеспечения</w:t>
+      </w:r>
+      <w:r>
+        <w:t xml:space="preserve"> </w:t>
+      </w:r>
+      <w:r>
+        <w:t xml:space="preserve">не забудьте перегрузить систему.</w:t>
+      </w:r>
+      <w:r>
+        <w:t xml:space="preserve"> </w:t>
+      </w:r>
+      <w:r>
+        <w:t xml:space="preserve">Далее выполните следующие действия:</w:t>
+      </w:r>
+      <w:r>
+        <w:t xml:space="preserve"> </w:t>
+      </w:r>
+      <w:r>
+        <w:t xml:space="preserve">1. Используя FAR, перейдите в созданный вами рабочий каталог с проектом. В этом</w:t>
+      </w:r>
+      <w:r>
+        <w:t xml:space="preserve"> </w:t>
+      </w:r>
+      <w:r>
+        <w:t xml:space="preserve">же каталоге должен быть размещён файл packer.exe. В командной строке введите</w:t>
+      </w:r>
+      <w:r>
+        <w:t xml:space="preserve"> </w:t>
+      </w:r>
+      <w:r>
+        <w:t xml:space="preserve">packer.exe init vagrant-rocky.pkr.hcl</w:t>
+      </w:r>
+      <w:r>
+        <w:t xml:space="preserve"> </w:t>
+      </w:r>
+      <w:r>
+        <w:t xml:space="preserve">packer.exe build vagrant-rocky.pkr.hcl (рис. 3)</w:t>
       </w:r>
     </w:p>
     <w:p>
@@ -292,20 +743,20 @@
       <w:r>
         <w:drawing>
           <wp:inline>
-            <wp:extent cx="3733800" cy="2388924"/>
+            <wp:extent cx="3733800" cy="1920692"/>
             <wp:effectExtent b="0" l="0" r="0" t="0"/>
-            <wp:docPr descr="Запускаем установку" title="" id="28" name="Picture"/>
+            <wp:docPr descr="Ждем загрузку" title="" id="29" name="Picture"/>
             <a:graphic>
               <a:graphicData uri="http://schemas.openxmlformats.org/drawingml/2006/picture">
                 <pic:pic>
                   <pic:nvPicPr>
-                    <pic:cNvPr descr="image/3.png" id="29" name="Picture"/>
+                    <pic:cNvPr descr="image/3.png" id="30" name="Picture"/>
                     <pic:cNvPicPr>
                       <a:picLocks noChangeArrowheads="1" noChangeAspect="1"/>
                     </pic:cNvPicPr>
                   </pic:nvPicPr>
                   <pic:blipFill>
-                    <a:blip r:embed="rId27"/>
+                    <a:blip r:embed="rId28"/>
                     <a:stretch>
                       <a:fillRect/>
                     </a:stretch>
@@ -313,7 +764,7 @@
                   <pic:spPr bwMode="auto">
                     <a:xfrm>
                       <a:off x="0" y="0"/>
-                      <a:ext cx="3733800" cy="2388924"/>
+                      <a:ext cx="3733800" cy="1920692"/>
                     </a:xfrm>
                     <a:prstGeom prst="rect">
                       <a:avLst/>
@@ -337,19 +788,33 @@
         <w:pStyle w:val="ImageCaption"/>
       </w:pPr>
       <w:r>
-        <w:t xml:space="preserve">Рис. 3: Запускаем установку</w:t>
-      </w:r>
-    </w:p>
-    <w:p>
-      <w:pPr>
-        <w:pStyle w:val="Compact"/>
-        <w:numPr>
-          <w:ilvl w:val="0"/>
-          <w:numId w:val="1004"/>
-        </w:numPr>
-      </w:pPr>
-      <w:r>
-        <w:t xml:space="preserve">Подключаем образ дополнительной гостевой ОС (рис. 4)</w:t>
+        <w:t xml:space="preserve">Рис. 3: Ждем загрузку</w:t>
+      </w:r>
+    </w:p>
+    <w:p>
+      <w:pPr>
+        <w:pStyle w:val="BodyText"/>
+      </w:pPr>
+      <w:r>
+        <w:t xml:space="preserve">для начала автоматической установки образа операционной системы Rocky Linux</w:t>
+      </w:r>
+      <w:r>
+        <w:t xml:space="preserve"> </w:t>
+      </w:r>
+      <w:r>
+        <w:t xml:space="preserve">в VirtualBox и последующего формирования box-файла с дистрибутивом Rocky Linux</w:t>
+      </w:r>
+      <w:r>
+        <w:t xml:space="preserve"> </w:t>
+      </w:r>
+      <w:r>
+        <w:t xml:space="preserve">для VirtualBox. По окончании процесса в рабочем каталоге сформируется box-файл</w:t>
+      </w:r>
+      <w:r>
+        <w:t xml:space="preserve"> </w:t>
+      </w:r>
+      <w:r>
+        <w:t xml:space="preserve">с названием vagrant-virtualbox-rockylinux10-x86_64.box. (рис. 4)</w:t>
       </w:r>
     </w:p>
     <w:p>
@@ -359,20 +824,20 @@
       <w:r>
         <w:drawing>
           <wp:inline>
-            <wp:extent cx="3733800" cy="2181377"/>
+            <wp:extent cx="3733800" cy="2027050"/>
             <wp:effectExtent b="0" l="0" r="0" t="0"/>
-            <wp:docPr descr="Подключаем" title="" id="31" name="Picture"/>
+            <wp:docPr descr="Рабочий каталог" title="" id="32" name="Picture"/>
             <a:graphic>
               <a:graphicData uri="http://schemas.openxmlformats.org/drawingml/2006/picture">
                 <pic:pic>
                   <pic:nvPicPr>
-                    <pic:cNvPr descr="image/4.png" id="32" name="Picture"/>
+                    <pic:cNvPr descr="image/4.png" id="33" name="Picture"/>
                     <pic:cNvPicPr>
                       <a:picLocks noChangeArrowheads="1" noChangeAspect="1"/>
                     </pic:cNvPicPr>
                   </pic:nvPicPr>
                   <pic:blipFill>
-                    <a:blip r:embed="rId30"/>
+                    <a:blip r:embed="rId31"/>
                     <a:stretch>
                       <a:fillRect/>
                     </a:stretch>
@@ -380,7 +845,7 @@
                   <pic:spPr bwMode="auto">
                     <a:xfrm>
                       <a:off x="0" y="0"/>
-                      <a:ext cx="3733800" cy="2181377"/>
+                      <a:ext cx="3733800" cy="2027050"/>
                     </a:xfrm>
                     <a:prstGeom prst="rect">
                       <a:avLst/>
@@ -404,60 +869,67 @@
         <w:pStyle w:val="ImageCaption"/>
       </w:pPr>
       <w:r>
-        <w:t xml:space="preserve">Рис. 4: Подключаем</w:t>
-      </w:r>
-    </w:p>
-    <w:bookmarkEnd w:id="33"/>
-    <w:bookmarkStart w:id="40" w:name="домашнее-задание"/>
-    <w:p>
-      <w:pPr>
-        <w:pStyle w:val="Heading1"/>
-      </w:pPr>
-      <w:r>
-        <w:rPr>
-          <w:rStyle w:val="SectionNumber"/>
-        </w:rPr>
-        <w:t xml:space="preserve">3</w:t>
-      </w:r>
-      <w:r>
-        <w:tab/>
-      </w:r>
-      <w:r>
-        <w:t xml:space="preserve">Домашнее задание</w:t>
-      </w:r>
-    </w:p>
-    <w:p>
-      <w:pPr>
-        <w:pStyle w:val="FirstParagraph"/>
-      </w:pPr>
-      <w:r>
-        <w:t xml:space="preserve">Дождитесь загрузки графического окружения и откройте терминал. В окне терминала проанализируйте последовательность загрузки системы, выполнив команду dmesg.</w:t>
-      </w:r>
-    </w:p>
-    <w:p>
-      <w:pPr>
-        <w:pStyle w:val="BodyText"/>
-      </w:pPr>
-      <w:r>
-        <w:t xml:space="preserve">Получите следующую информацию.</w:t>
-      </w:r>
-      <w:r>
-        <w:t xml:space="preserve"> </w:t>
-      </w:r>
-      <w:r>
-        <w:t xml:space="preserve">1. Версия ядра Linux (Linux version).</w:t>
-      </w:r>
-      <w:r>
-        <w:t xml:space="preserve"> </w:t>
-      </w:r>
-      <w:r>
-        <w:t xml:space="preserve">2. Частота процессора (Detected Mhz processor).</w:t>
-      </w:r>
-      <w:r>
-        <w:t xml:space="preserve"> </w:t>
-      </w:r>
-      <w:r>
-        <w:t xml:space="preserve">3. Модель процессора (CPU0).(рис. 5)</w:t>
+        <w:t xml:space="preserve">Рис. 4: Рабочий каталог</w:t>
+      </w:r>
+    </w:p>
+    <w:p>
+      <w:pPr>
+        <w:pStyle w:val="Compact"/>
+        <w:numPr>
+          <w:ilvl w:val="0"/>
+          <w:numId w:val="1004"/>
+        </w:numPr>
+      </w:pPr>
+      <w:r>
+        <w:t xml:space="preserve">Для регистрации образа виртуальной машины в vagrant в командной строке введи-</w:t>
+      </w:r>
+      <w:r>
+        <w:t xml:space="preserve"> </w:t>
+      </w:r>
+      <w:r>
+        <w:t xml:space="preserve">те</w:t>
+      </w:r>
+      <w:r>
+        <w:t xml:space="preserve"> </w:t>
+      </w:r>
+      <w:r>
+        <w:t xml:space="preserve">vagrant box add rockylinux10 vagrant-virtualbox-rockylinux10-x86_64.box</w:t>
+      </w:r>
+    </w:p>
+    <w:p>
+      <w:pPr>
+        <w:pStyle w:val="Compact"/>
+        <w:numPr>
+          <w:ilvl w:val="0"/>
+          <w:numId w:val="1004"/>
+        </w:numPr>
+      </w:pPr>
+      <w:r>
+        <w:t xml:space="preserve">Для запуска виртуальной машины Server введите в консоли</w:t>
+      </w:r>
+      <w:r>
+        <w:t xml:space="preserve"> </w:t>
+      </w:r>
+      <w:r>
+        <w:t xml:space="preserve">vagrant up server</w:t>
+      </w:r>
+    </w:p>
+    <w:p>
+      <w:pPr>
+        <w:pStyle w:val="Compact"/>
+        <w:numPr>
+          <w:ilvl w:val="0"/>
+          <w:numId w:val="1004"/>
+        </w:numPr>
+      </w:pPr>
+      <w:r>
+        <w:t xml:space="preserve">Для запуска виртуальной машины Client введите в консоли</w:t>
+      </w:r>
+      <w:r>
+        <w:t xml:space="preserve"> </w:t>
+      </w:r>
+      <w:r>
+        <w:t xml:space="preserve">vagrant up client(рис. 5)</w:t>
       </w:r>
     </w:p>
     <w:p>
@@ -467,9 +939,9 @@
       <w:r>
         <w:drawing>
           <wp:inline>
-            <wp:extent cx="3733800" cy="2606294"/>
+            <wp:extent cx="3733800" cy="1715355"/>
             <wp:effectExtent b="0" l="0" r="0" t="0"/>
-            <wp:docPr descr="Запускаем установку" title="" id="35" name="Picture"/>
+            <wp:docPr descr="Запускаем" title="" id="35" name="Picture"/>
             <a:graphic>
               <a:graphicData uri="http://schemas.openxmlformats.org/drawingml/2006/picture">
                 <pic:pic>
@@ -488,7 +960,7 @@
                   <pic:spPr bwMode="auto">
                     <a:xfrm>
                       <a:off x="0" y="0"/>
-                      <a:ext cx="3733800" cy="2606294"/>
+                      <a:ext cx="3733800" cy="1715355"/>
                     </a:xfrm>
                     <a:prstGeom prst="rect">
                       <a:avLst/>
@@ -512,7 +984,7 @@
         <w:pStyle w:val="ImageCaption"/>
       </w:pPr>
       <w:r>
-        <w:t xml:space="preserve">Рис. 5: Запускаем установку</w:t>
+        <w:t xml:space="preserve">Рис. 5: Запускаем</w:t>
       </w:r>
     </w:p>
     <w:p>
@@ -524,7 +996,13 @@
         </w:numPr>
       </w:pPr>
       <w:r>
-        <w:t xml:space="preserve">Объем доступной оперативной памяти (Memory available).</w:t>
+        <w:t xml:space="preserve">Убедитесь, что запуск обеих виртуальных машин прошёл успешно, залогиньтесь</w:t>
+      </w:r>
+      <w:r>
+        <w:t xml:space="preserve"> </w:t>
+      </w:r>
+      <w:r>
+        <w:t xml:space="preserve">под пользователем vagrant с паролем vagrant в графическом окружении.</w:t>
       </w:r>
     </w:p>
     <w:p>
@@ -536,7 +1014,13 @@
         </w:numPr>
       </w:pPr>
       <w:r>
-        <w:t xml:space="preserve">Тип обнаруженного гипервизора (Hypervisor detected).</w:t>
+        <w:t xml:space="preserve">Подключитесь к серверу из консоли:</w:t>
+      </w:r>
+      <w:r>
+        <w:t xml:space="preserve"> </w:t>
+      </w:r>
+      <w:r>
+        <w:t xml:space="preserve">vagrant ssh server</w:t>
       </w:r>
     </w:p>
     <w:p>
@@ -548,19 +1032,7 @@
         </w:numPr>
       </w:pPr>
       <w:r>
-        <w:t xml:space="preserve">Тип файловой системы корневого раздела.</w:t>
-      </w:r>
-    </w:p>
-    <w:p>
-      <w:pPr>
-        <w:pStyle w:val="Compact"/>
-        <w:numPr>
-          <w:ilvl w:val="0"/>
-          <w:numId w:val="1005"/>
-        </w:numPr>
-      </w:pPr>
-      <w:r>
-        <w:t xml:space="preserve">Последовательность монтирования файловых систем.(рис. 6)</w:t>
+        <w:t xml:space="preserve">Введите пароль vagrant.(рис. 6)</w:t>
       </w:r>
     </w:p>
     <w:p>
@@ -570,9 +1042,9 @@
       <w:r>
         <w:drawing>
           <wp:inline>
-            <wp:extent cx="3733800" cy="2626220"/>
+            <wp:extent cx="3733800" cy="2511193"/>
             <wp:effectExtent b="0" l="0" r="0" t="0"/>
-            <wp:docPr descr="Запускаем установку" title="" id="38" name="Picture"/>
+            <wp:docPr descr="Вводим пароль" title="" id="38" name="Picture"/>
             <a:graphic>
               <a:graphicData uri="http://schemas.openxmlformats.org/drawingml/2006/picture">
                 <pic:pic>
@@ -591,7 +1063,7 @@
                   <pic:spPr bwMode="auto">
                     <a:xfrm>
                       <a:off x="0" y="0"/>
-                      <a:ext cx="3733800" cy="2626220"/>
+                      <a:ext cx="3733800" cy="2511193"/>
                     </a:xfrm>
                     <a:prstGeom prst="rect">
                       <a:avLst/>
@@ -615,11 +1087,132 @@
         <w:pStyle w:val="ImageCaption"/>
       </w:pPr>
       <w:r>
-        <w:t xml:space="preserve">Рис. 6: Запускаем установку</w:t>
-      </w:r>
-    </w:p>
-    <w:bookmarkEnd w:id="40"/>
-    <w:bookmarkStart w:id="41" w:name="контрольные-вопросы"/>
+        <w:t xml:space="preserve">Рис. 6: Вводим пароль</w:t>
+      </w:r>
+    </w:p>
+    <w:p>
+      <w:pPr>
+        <w:pStyle w:val="Compact"/>
+        <w:numPr>
+          <w:ilvl w:val="0"/>
+          <w:numId w:val="1006"/>
+        </w:numPr>
+      </w:pPr>
+      <w:r>
+        <w:t xml:space="preserve">Перейдите к пользователю user (вместо user должен быть указан ваш логин):</w:t>
+      </w:r>
+      <w:r>
+        <w:t xml:space="preserve"> </w:t>
+      </w:r>
+      <w:r>
+        <w:t xml:space="preserve">su - user</w:t>
+      </w:r>
+    </w:p>
+    <w:p>
+      <w:pPr>
+        <w:pStyle w:val="Compact"/>
+        <w:numPr>
+          <w:ilvl w:val="0"/>
+          <w:numId w:val="1006"/>
+        </w:numPr>
+      </w:pPr>
+      <w:r>
+        <w:t xml:space="preserve">Отлогиньтесь.</w:t>
+      </w:r>
+    </w:p>
+    <w:p>
+      <w:pPr>
+        <w:pStyle w:val="Compact"/>
+        <w:numPr>
+          <w:ilvl w:val="0"/>
+          <w:numId w:val="1006"/>
+        </w:numPr>
+      </w:pPr>
+      <w:r>
+        <w:t xml:space="preserve">Выполните тоже самое для клиента.</w:t>
+      </w:r>
+    </w:p>
+    <w:p>
+      <w:pPr>
+        <w:pStyle w:val="Compact"/>
+        <w:numPr>
+          <w:ilvl w:val="0"/>
+          <w:numId w:val="1006"/>
+        </w:numPr>
+      </w:pPr>
+      <w:r>
+        <w:t xml:space="preserve">Выключите обе виртуальные машины:</w:t>
+      </w:r>
+      <w:r>
+        <w:t xml:space="preserve"> </w:t>
+      </w:r>
+      <w:r>
+        <w:t xml:space="preserve">vagrant halt server</w:t>
+      </w:r>
+      <w:r>
+        <w:t xml:space="preserve"> </w:t>
+      </w:r>
+      <w:r>
+        <w:t xml:space="preserve">vagrant halt client(рис. 7)</w:t>
+      </w:r>
+    </w:p>
+    <w:p>
+      <w:pPr>
+        <w:pStyle w:val="CaptionedFigure"/>
+      </w:pPr>
+      <w:r>
+        <w:drawing>
+          <wp:inline>
+            <wp:extent cx="3733800" cy="1823937"/>
+            <wp:effectExtent b="0" l="0" r="0" t="0"/>
+            <wp:docPr descr="Выключаем" title="" id="41" name="Picture"/>
+            <a:graphic>
+              <a:graphicData uri="http://schemas.openxmlformats.org/drawingml/2006/picture">
+                <pic:pic>
+                  <pic:nvPicPr>
+                    <pic:cNvPr descr="image/7.png" id="42" name="Picture"/>
+                    <pic:cNvPicPr>
+                      <a:picLocks noChangeArrowheads="1" noChangeAspect="1"/>
+                    </pic:cNvPicPr>
+                  </pic:nvPicPr>
+                  <pic:blipFill>
+                    <a:blip r:embed="rId40"/>
+                    <a:stretch>
+                      <a:fillRect/>
+                    </a:stretch>
+                  </pic:blipFill>
+                  <pic:spPr bwMode="auto">
+                    <a:xfrm>
+                      <a:off x="0" y="0"/>
+                      <a:ext cx="3733800" cy="1823937"/>
+                    </a:xfrm>
+                    <a:prstGeom prst="rect">
+                      <a:avLst/>
+                    </a:prstGeom>
+                    <a:noFill/>
+                    <a:ln w="9525">
+                      <a:noFill/>
+                      <a:headEnd/>
+                      <a:tailEnd/>
+                    </a:ln>
+                  </pic:spPr>
+                </pic:pic>
+              </a:graphicData>
+            </a:graphic>
+          </wp:inline>
+        </w:drawing>
+      </w:r>
+    </w:p>
+    <w:p>
+      <w:pPr>
+        <w:pStyle w:val="ImageCaption"/>
+      </w:pPr>
+      <w:r>
+        <w:t xml:space="preserve">Рис. 7: Выключаем</w:t>
+      </w:r>
+    </w:p>
+    <w:bookmarkEnd w:id="43"/>
+    <w:bookmarkStart w:id="44" w:name="контрольные-вопросы"/>
     <w:p>
       <w:pPr>
         <w:pStyle w:val="Heading1"/>
@@ -639,135 +1232,50 @@
     </w:p>
     <w:p>
       <w:pPr>
-        <w:pStyle w:val="FirstParagraph"/>
-      </w:pPr>
-      <w:r>
-        <w:t xml:space="preserve">Ответы:</w:t>
-      </w:r>
-    </w:p>
-    <w:p>
-      <w:pPr>
         <w:numPr>
           <w:ilvl w:val="0"/>
-          <w:numId w:val="1006"/>
+          <w:numId w:val="1007"/>
         </w:numPr>
       </w:pPr>
       <w:r>
-        <w:t xml:space="preserve">Команды терминала и примеры:</w:t>
-      </w:r>
-      <w:r>
-        <w:t xml:space="preserve"> </w:t>
-      </w:r>
-      <w:r>
-        <w:t xml:space="preserve">Получение справки: Команда man [команда] или [команда] –help предоставит подробную информацию о любой команде.</w:t>
-      </w:r>
-      <w:r>
-        <w:t xml:space="preserve"> </w:t>
-      </w:r>
-      <w:r>
-        <w:t xml:space="preserve">Перемещение по файловой системе: Команда cd [путь]позволяет перемещаться между каталогами, cd .. поднимает на уровень выше, а cd ~возвращает в домашний каталог.</w:t>
-      </w:r>
-      <w:r>
-        <w:t xml:space="preserve"> </w:t>
-      </w:r>
-      <w:r>
-        <w:t xml:space="preserve">Просмотр содержимого каталога: ls показывает список файлов и каталогов, а ls -lпредоставляет детальную информацию о них.</w:t>
-      </w:r>
-      <w:r>
-        <w:t xml:space="preserve"> </w:t>
-      </w:r>
-      <w:r>
-        <w:t xml:space="preserve">Определение объёма каталога:Команда du -sh [путь_к_каталогу] покажет общий размер каталога в удобочитаемом формате.</w:t>
-      </w:r>
-      <w:r>
-        <w:t xml:space="preserve"> </w:t>
-      </w:r>
-      <w:r>
-        <w:t xml:space="preserve">Создание / удаление каталогов / файлов: mkdir и rmdir создают и удаляют каталоги (последний только пустые), touch создает файлы, а rm удаляет файлы или каталоги (с опцией -r).</w:t>
-      </w:r>
-      <w:r>
-        <w:t xml:space="preserve"> </w:t>
-      </w:r>
-      <w:r>
-        <w:t xml:space="preserve">Задание определённых прав на файл / каталог: Команда chmod [права] [файл/каталог]изменяет права доступа к файлам и каталогам, например chmod 644 myfile.txt.</w:t>
-      </w:r>
-      <w:r>
-        <w:t xml:space="preserve"> </w:t>
-      </w:r>
-      <w:r>
-        <w:t xml:space="preserve">Просмотр истории команд:Команда history отображает список ранее введенных команд.</w:t>
+        <w:t xml:space="preserve">Vagrant — инструмент для создания и управления воспроизводимыми виртуальными средами (ВМ) с единым рабочим процессом, используемый для разработки и тестирования инфраструктуры.</w:t>
       </w:r>
     </w:p>
     <w:p>
       <w:pPr>
         <w:numPr>
           <w:ilvl w:val="0"/>
-          <w:numId w:val="1006"/>
+          <w:numId w:val="1007"/>
         </w:numPr>
       </w:pPr>
       <w:r>
-        <w:t xml:space="preserve">Информация в учётной записи пользователя и команды:</w:t>
-      </w:r>
-      <w:r>
-        <w:t xml:space="preserve"> </w:t>
-      </w:r>
-      <w:r>
-        <w:t xml:space="preserve">Учётная запись пользователя включает имя, ID, домашний каталог, оболочку и членство в группах, а команды id [имя_пользователя] и whoami позволяют просмотреть эту информацию.</w:t>
+        <w:t xml:space="preserve">Box-файл — это архив (tar/tar.gz/zip) с образом виртуальной машины для конкретного провайдера (VirtualBox, VMware и т.д.). Vagrantfile — конфигурационный файл проекта, описывающий тип и параметры ВМ, её настройку и провижининг</w:t>
       </w:r>
     </w:p>
     <w:p>
       <w:pPr>
         <w:numPr>
           <w:ilvl w:val="0"/>
-          <w:numId w:val="1006"/>
+          <w:numId w:val="1007"/>
         </w:numPr>
       </w:pPr>
       <w:r>
-        <w:t xml:space="preserve">Файловая система:</w:t>
-      </w:r>
-      <w:r>
-        <w:t xml:space="preserve"> </w:t>
-      </w:r>
-      <w:r>
-        <w:t xml:space="preserve">Файловая система — это структура организации данных на диске, например ext4, XFS или NTFS, определяющая, как файлы хранятся и доступны.</w:t>
+        <w:t xml:space="preserve">Основные команды: vagrant up (запуск), vagrant halt (остановка), vagrant ssh (вход по SSH), vagrant destroy (удаление), vagrant status (статус), vagrant reload (перезагрузка с новым Vagrantfile).</w:t>
       </w:r>
     </w:p>
     <w:p>
       <w:pPr>
         <w:numPr>
           <w:ilvl w:val="0"/>
-          <w:numId w:val="1006"/>
+          <w:numId w:val="1007"/>
         </w:numPr>
       </w:pPr>
       <w:r>
-        <w:t xml:space="preserve">Просмотр смонтированных файловых систем:</w:t>
-      </w:r>
-      <w:r>
-        <w:t xml:space="preserve"> </w:t>
-      </w:r>
-      <w:r>
-        <w:t xml:space="preserve">Команды mount и df -hпоказывают, какие файловые системы в данный момент доступны в операционной системе.</w:t>
-      </w:r>
-    </w:p>
-    <w:p>
-      <w:pPr>
-        <w:numPr>
-          <w:ilvl w:val="0"/>
-          <w:numId w:val="1006"/>
-        </w:numPr>
-      </w:pPr>
-      <w:r>
-        <w:t xml:space="preserve">Удаление зависшего процесса:</w:t>
-      </w:r>
-      <w:r>
-        <w:t xml:space="preserve"> </w:t>
-      </w:r>
-      <w:r>
-        <w:t xml:space="preserve">Зависший процесс удаляется с помощью команды kill [PID], а при необходимости более принудительно — kill -9 [PID], предварительно определив его PID командами psили pgrep.</w:t>
-      </w:r>
-    </w:p>
-    <w:bookmarkEnd w:id="41"/>
-    <w:bookmarkStart w:id="42" w:name="выводы"/>
+        <w:t xml:space="preserve">Построчные пояснения требуют содержимого файлов, которого нет в вопросе. vagrant-rocky.pkr.hcl — конфигурация Packer для сборки box; ks.cfg — Kickstart-файл автоматической установки Rocky Linux; Vagrantfile — конфигурация ВМ; Makefile — автоматизация сборки/управления.</w:t>
+      </w:r>
+    </w:p>
+    <w:bookmarkEnd w:id="44"/>
+    <w:bookmarkStart w:id="45" w:name="выводы"/>
     <w:p>
       <w:pPr>
         <w:pStyle w:val="Heading1"/>
@@ -790,10 +1298,16 @@
         <w:pStyle w:val="FirstParagraph"/>
       </w:pPr>
       <w:r>
-        <w:t xml:space="preserve">Мы приобретели практических навыков установки операционной системы на виртуальную машину, настройки минимально необходимых для дальнейшей работы сервисов.</w:t>
-      </w:r>
-    </w:p>
-    <w:bookmarkEnd w:id="42"/>
+        <w:t xml:space="preserve">Мы приобретели практические навыки установки</w:t>
+      </w:r>
+      <w:r>
+        <w:t xml:space="preserve"> </w:t>
+      </w:r>
+      <w:r>
+        <w:t xml:space="preserve">Rocky Linux на виртуальную машину с помощью инструмента Vagrant.</w:t>
+      </w:r>
+    </w:p>
+    <w:bookmarkEnd w:id="45"/>
     <w:sectPr/>
   </w:body>
 </w:document>
@@ -985,6 +1499,91 @@
       </w:pPr>
     </w:lvl>
   </w:abstractNum>
+  <w:abstractNum w:abstractNumId="99413">
+    <w:nsid w:val="00A99413"/>
+    <w:multiLevelType w:val="multilevel"/>
+    <w:lvl w:ilvl="0">
+      <w:start w:val="3"/>
+      <w:numFmt w:val="decimal"/>
+      <w:lvlText w:val="%1."/>
+      <w:lvlJc w:val="left"/>
+      <w:pPr>
+        <w:ind w:left="720" w:hanging="480"/>
+      </w:pPr>
+    </w:lvl>
+    <w:lvl w:ilvl="1">
+      <w:start w:val="3"/>
+      <w:numFmt w:val="decimal"/>
+      <w:lvlText w:val="%2."/>
+      <w:lvlJc w:val="left"/>
+      <w:pPr>
+        <w:ind w:left="1440" w:hanging="480"/>
+      </w:pPr>
+    </w:lvl>
+    <w:lvl w:ilvl="2">
+      <w:start w:val="3"/>
+      <w:numFmt w:val="decimal"/>
+      <w:lvlText w:val="%3."/>
+      <w:lvlJc w:val="left"/>
+      <w:pPr>
+        <w:ind w:left="2160" w:hanging="480"/>
+      </w:pPr>
+    </w:lvl>
+    <w:lvl w:ilvl="3">
+      <w:start w:val="3"/>
+      <w:numFmt w:val="decimal"/>
+      <w:lvlText w:val="%4."/>
+      <w:lvlJc w:val="left"/>
+      <w:pPr>
+        <w:ind w:left="2880" w:hanging="480"/>
+      </w:pPr>
+    </w:lvl>
+    <w:lvl w:ilvl="4">
+      <w:start w:val="3"/>
+      <w:numFmt w:val="decimal"/>
+      <w:lvlText w:val="%5."/>
+      <w:lvlJc w:val="left"/>
+      <w:pPr>
+        <w:ind w:left="3600" w:hanging="480"/>
+      </w:pPr>
+    </w:lvl>
+    <w:lvl w:ilvl="5">
+      <w:start w:val="3"/>
+      <w:numFmt w:val="decimal"/>
+      <w:lvlText w:val="%6."/>
+      <w:lvlJc w:val="left"/>
+      <w:pPr>
+        <w:ind w:left="4320" w:hanging="480"/>
+      </w:pPr>
+    </w:lvl>
+    <w:lvl w:ilvl="6">
+      <w:start w:val="3"/>
+      <w:numFmt w:val="decimal"/>
+      <w:lvlText w:val="%7."/>
+      <w:lvlJc w:val="left"/>
+      <w:pPr>
+        <w:ind w:left="5040" w:hanging="480"/>
+      </w:pPr>
+    </w:lvl>
+    <w:lvl w:ilvl="7">
+      <w:start w:val="3"/>
+      <w:numFmt w:val="decimal"/>
+      <w:lvlText w:val="%8."/>
+      <w:lvlJc w:val="left"/>
+      <w:pPr>
+        <w:ind w:left="5760" w:hanging="480"/>
+      </w:pPr>
+    </w:lvl>
+    <w:lvl w:ilvl="8">
+      <w:start w:val="3"/>
+      <w:numFmt w:val="decimal"/>
+      <w:lvlText w:val="%9."/>
+      <w:lvlJc w:val="left"/>
+      <w:pPr>
+        <w:ind w:left="6480" w:hanging="480"/>
+      </w:pPr>
+    </w:lvl>
+  </w:abstractNum>
   <w:abstractNum w:abstractNumId="99412">
     <w:nsid w:val="00A99412"/>
     <w:multiLevelType w:val="multilevel"/>
@@ -1070,11 +1669,11 @@
       </w:pPr>
     </w:lvl>
   </w:abstractNum>
-  <w:abstractNum w:abstractNumId="99413">
-    <w:nsid w:val="00A99413"/>
+  <w:abstractNum w:abstractNumId="99415">
+    <w:nsid w:val="00A99415"/>
     <w:multiLevelType w:val="multilevel"/>
     <w:lvl w:ilvl="0">
-      <w:start w:val="3"/>
+      <w:start w:val="5"/>
       <w:numFmt w:val="decimal"/>
       <w:lvlText w:val="%1."/>
       <w:lvlJc w:val="left"/>
@@ -1083,7 +1682,7 @@
       </w:pPr>
     </w:lvl>
     <w:lvl w:ilvl="1">
-      <w:start w:val="3"/>
+      <w:start w:val="5"/>
       <w:numFmt w:val="decimal"/>
       <w:lvlText w:val="%2."/>
       <w:lvlJc w:val="left"/>
@@ -1092,7 +1691,7 @@
       </w:pPr>
     </w:lvl>
     <w:lvl w:ilvl="2">
-      <w:start w:val="3"/>
+      <w:start w:val="5"/>
       <w:numFmt w:val="decimal"/>
       <w:lvlText w:val="%3."/>
       <w:lvlJc w:val="left"/>
@@ -1101,7 +1700,7 @@
       </w:pPr>
     </w:lvl>
     <w:lvl w:ilvl="3">
-      <w:start w:val="3"/>
+      <w:start w:val="5"/>
       <w:numFmt w:val="decimal"/>
       <w:lvlText w:val="%4."/>
       <w:lvlJc w:val="left"/>
@@ -1110,7 +1709,7 @@
       </w:pPr>
     </w:lvl>
     <w:lvl w:ilvl="4">
-      <w:start w:val="3"/>
+      <w:start w:val="5"/>
       <w:numFmt w:val="decimal"/>
       <w:lvlText w:val="%5."/>
       <w:lvlJc w:val="left"/>
@@ -1119,7 +1718,7 @@
       </w:pPr>
     </w:lvl>
     <w:lvl w:ilvl="5">
-      <w:start w:val="3"/>
+      <w:start w:val="5"/>
       <w:numFmt w:val="decimal"/>
       <w:lvlText w:val="%6."/>
       <w:lvlJc w:val="left"/>
@@ -1128,7 +1727,7 @@
       </w:pPr>
     </w:lvl>
     <w:lvl w:ilvl="6">
-      <w:start w:val="3"/>
+      <w:start w:val="5"/>
       <w:numFmt w:val="decimal"/>
       <w:lvlText w:val="%7."/>
       <w:lvlJc w:val="left"/>
@@ -1137,7 +1736,7 @@
       </w:pPr>
     </w:lvl>
     <w:lvl w:ilvl="7">
-      <w:start w:val="3"/>
+      <w:start w:val="5"/>
       <w:numFmt w:val="decimal"/>
       <w:lvlText w:val="%8."/>
       <w:lvlJc w:val="left"/>
@@ -1146,7 +1745,7 @@
       </w:pPr>
     </w:lvl>
     <w:lvl w:ilvl="8">
-      <w:start w:val="3"/>
+      <w:start w:val="5"/>
       <w:numFmt w:val="decimal"/>
       <w:lvlText w:val="%9."/>
       <w:lvlJc w:val="left"/>
@@ -1155,11 +1754,11 @@
       </w:pPr>
     </w:lvl>
   </w:abstractNum>
-  <w:abstractNum w:abstractNumId="99414">
-    <w:nsid w:val="00A99414"/>
+  <w:abstractNum w:abstractNumId="99418">
+    <w:nsid w:val="00A99418"/>
     <w:multiLevelType w:val="multilevel"/>
     <w:lvl w:ilvl="0">
-      <w:start w:val="4"/>
+      <w:start w:val="8"/>
       <w:numFmt w:val="decimal"/>
       <w:lvlText w:val="%1."/>
       <w:lvlJc w:val="left"/>
@@ -1168,7 +1767,7 @@
       </w:pPr>
     </w:lvl>
     <w:lvl w:ilvl="1">
-      <w:start w:val="4"/>
+      <w:start w:val="8"/>
       <w:numFmt w:val="decimal"/>
       <w:lvlText w:val="%2."/>
       <w:lvlJc w:val="left"/>
@@ -1177,7 +1776,7 @@
       </w:pPr>
     </w:lvl>
     <w:lvl w:ilvl="2">
-      <w:start w:val="4"/>
+      <w:start w:val="8"/>
       <w:numFmt w:val="decimal"/>
       <w:lvlText w:val="%3."/>
       <w:lvlJc w:val="left"/>
@@ -1186,7 +1785,7 @@
       </w:pPr>
     </w:lvl>
     <w:lvl w:ilvl="3">
-      <w:start w:val="4"/>
+      <w:start w:val="8"/>
       <w:numFmt w:val="decimal"/>
       <w:lvlText w:val="%4."/>
       <w:lvlJc w:val="left"/>
@@ -1195,7 +1794,7 @@
       </w:pPr>
     </w:lvl>
     <w:lvl w:ilvl="4">
-      <w:start w:val="4"/>
+      <w:start w:val="8"/>
       <w:numFmt w:val="decimal"/>
       <w:lvlText w:val="%5."/>
       <w:lvlJc w:val="left"/>
@@ -1204,7 +1803,7 @@
       </w:pPr>
     </w:lvl>
     <w:lvl w:ilvl="5">
-      <w:start w:val="4"/>
+      <w:start w:val="8"/>
       <w:numFmt w:val="decimal"/>
       <w:lvlText w:val="%6."/>
       <w:lvlJc w:val="left"/>
@@ -1213,7 +1812,7 @@
       </w:pPr>
     </w:lvl>
     <w:lvl w:ilvl="6">
-      <w:start w:val="4"/>
+      <w:start w:val="8"/>
       <w:numFmt w:val="decimal"/>
       <w:lvlText w:val="%7."/>
       <w:lvlJc w:val="left"/>
@@ -1222,7 +1821,7 @@
       </w:pPr>
     </w:lvl>
     <w:lvl w:ilvl="7">
-      <w:start w:val="4"/>
+      <w:start w:val="8"/>
       <w:numFmt w:val="decimal"/>
       <w:lvlText w:val="%8."/>
       <w:lvlJc w:val="left"/>
@@ -1231,7 +1830,7 @@
       </w:pPr>
     </w:lvl>
     <w:lvl w:ilvl="8">
-      <w:start w:val="4"/>
+      <w:start w:val="8"/>
       <w:numFmt w:val="decimal"/>
       <w:lvlText w:val="%9."/>
       <w:lvlJc w:val="left"/>
@@ -1274,33 +1873,33 @@
     </w:lvlOverride>
   </w:num>
   <w:num w:numId="1002">
-    <w:abstractNumId w:val="99412"/>
+    <w:abstractNumId w:val="99411"/>
     <w:lvlOverride w:ilvl="0">
-      <w:startOverride w:val="2"/>
+      <w:startOverride w:val="1"/>
     </w:lvlOverride>
     <w:lvlOverride w:ilvl="1">
-      <w:startOverride w:val="2"/>
+      <w:startOverride w:val="1"/>
     </w:lvlOverride>
     <w:lvlOverride w:ilvl="2">
-      <w:startOverride w:val="2"/>
+      <w:startOverride w:val="1"/>
     </w:lvlOverride>
     <w:lvlOverride w:ilvl="3">
-      <w:startOverride w:val="2"/>
+      <w:startOverride w:val="1"/>
     </w:lvlOverride>
     <w:lvlOverride w:ilvl="4">
-      <w:startOverride w:val="2"/>
+      <w:startOverride w:val="1"/>
     </w:lvlOverride>
     <w:lvlOverride w:ilvl="5">
-      <w:startOverride w:val="2"/>
+      <w:startOverride w:val="1"/>
     </w:lvlOverride>
     <w:lvlOverride w:ilvl="6">
-      <w:startOverride w:val="2"/>
+      <w:startOverride w:val="1"/>
     </w:lvlOverride>
     <w:lvlOverride w:ilvl="7">
-      <w:startOverride w:val="2"/>
+      <w:startOverride w:val="1"/>
     </w:lvlOverride>
     <w:lvlOverride w:ilvl="8">
-      <w:startOverride w:val="2"/>
+      <w:startOverride w:val="1"/>
     </w:lvlOverride>
   </w:num>
   <w:num w:numId="1003">
@@ -1334,66 +1933,96 @@
     </w:lvlOverride>
   </w:num>
   <w:num w:numId="1004">
-    <w:abstractNumId w:val="99414"/>
+    <w:abstractNumId w:val="99412"/>
     <w:lvlOverride w:ilvl="0">
-      <w:startOverride w:val="4"/>
+      <w:startOverride w:val="2"/>
     </w:lvlOverride>
     <w:lvlOverride w:ilvl="1">
-      <w:startOverride w:val="4"/>
+      <w:startOverride w:val="2"/>
     </w:lvlOverride>
     <w:lvlOverride w:ilvl="2">
-      <w:startOverride w:val="4"/>
+      <w:startOverride w:val="2"/>
     </w:lvlOverride>
     <w:lvlOverride w:ilvl="3">
-      <w:startOverride w:val="4"/>
+      <w:startOverride w:val="2"/>
     </w:lvlOverride>
     <w:lvlOverride w:ilvl="4">
-      <w:startOverride w:val="4"/>
+      <w:startOverride w:val="2"/>
     </w:lvlOverride>
     <w:lvlOverride w:ilvl="5">
-      <w:startOverride w:val="4"/>
+      <w:startOverride w:val="2"/>
     </w:lvlOverride>
     <w:lvlOverride w:ilvl="6">
-      <w:startOverride w:val="4"/>
+      <w:startOverride w:val="2"/>
     </w:lvlOverride>
     <w:lvlOverride w:ilvl="7">
-      <w:startOverride w:val="4"/>
+      <w:startOverride w:val="2"/>
     </w:lvlOverride>
     <w:lvlOverride w:ilvl="8">
-      <w:startOverride w:val="4"/>
+      <w:startOverride w:val="2"/>
     </w:lvlOverride>
   </w:num>
   <w:num w:numId="1005">
-    <w:abstractNumId w:val="99414"/>
+    <w:abstractNumId w:val="99415"/>
     <w:lvlOverride w:ilvl="0">
-      <w:startOverride w:val="4"/>
+      <w:startOverride w:val="5"/>
     </w:lvlOverride>
     <w:lvlOverride w:ilvl="1">
-      <w:startOverride w:val="4"/>
+      <w:startOverride w:val="5"/>
     </w:lvlOverride>
     <w:lvlOverride w:ilvl="2">
-      <w:startOverride w:val="4"/>
+      <w:startOverride w:val="5"/>
     </w:lvlOverride>
     <w:lvlOverride w:ilvl="3">
-      <w:startOverride w:val="4"/>
+      <w:startOverride w:val="5"/>
     </w:lvlOverride>
     <w:lvlOverride w:ilvl="4">
-      <w:startOverride w:val="4"/>
+      <w:startOverride w:val="5"/>
     </w:lvlOverride>
     <w:lvlOverride w:ilvl="5">
-      <w:startOverride w:val="4"/>
+      <w:startOverride w:val="5"/>
     </w:lvlOverride>
     <w:lvlOverride w:ilvl="6">
-      <w:startOverride w:val="4"/>
+      <w:startOverride w:val="5"/>
     </w:lvlOverride>
     <w:lvlOverride w:ilvl="7">
-      <w:startOverride w:val="4"/>
+      <w:startOverride w:val="5"/>
     </w:lvlOverride>
     <w:lvlOverride w:ilvl="8">
-      <w:startOverride w:val="4"/>
+      <w:startOverride w:val="5"/>
     </w:lvlOverride>
   </w:num>
   <w:num w:numId="1006">
+    <w:abstractNumId w:val="99418"/>
+    <w:lvlOverride w:ilvl="0">
+      <w:startOverride w:val="8"/>
+    </w:lvlOverride>
+    <w:lvlOverride w:ilvl="1">
+      <w:startOverride w:val="8"/>
+    </w:lvlOverride>
+    <w:lvlOverride w:ilvl="2">
+      <w:startOverride w:val="8"/>
+    </w:lvlOverride>
+    <w:lvlOverride w:ilvl="3">
+      <w:startOverride w:val="8"/>
+    </w:lvlOverride>
+    <w:lvlOverride w:ilvl="4">
+      <w:startOverride w:val="8"/>
+    </w:lvlOverride>
+    <w:lvlOverride w:ilvl="5">
+      <w:startOverride w:val="8"/>
+    </w:lvlOverride>
+    <w:lvlOverride w:ilvl="6">
+      <w:startOverride w:val="8"/>
+    </w:lvlOverride>
+    <w:lvlOverride w:ilvl="7">
+      <w:startOverride w:val="8"/>
+    </w:lvlOverride>
+    <w:lvlOverride w:ilvl="8">
+      <w:startOverride w:val="8"/>
+    </w:lvlOverride>
+  </w:num>
+  <w:num w:numId="1007">
     <w:abstractNumId w:val="99411"/>
     <w:lvlOverride w:ilvl="0">
       <w:startOverride w:val="1"/>

</xml_diff>